<commit_message>
EDIT: modified code comments, updated documentation
</commit_message>
<xml_diff>
--- a/Documents/PrecRtdSim-datasheet.docx
+++ b/Documents/PrecRtdSim-datasheet.docx
@@ -927,37 +927,21 @@
                 <w:b w:val="0"/>
                 <w:bCs w:val="0"/>
               </w:rPr>
-              <w:t xml:space="preserve">Power supply </w:t>
-            </w:r>
-            <w:proofErr w:type="gramStart"/>
+              <w:t>Power supply consumption</w:t>
+            </w:r>
             <w:r>
               <w:rPr>
                 <w:b w:val="0"/>
                 <w:bCs w:val="0"/>
               </w:rPr>
-              <w:t>consumption</w:t>
+              <w:t xml:space="preserve"> </w:t>
             </w:r>
             <w:r>
               <w:rPr>
                 <w:b w:val="0"/>
                 <w:bCs w:val="0"/>
               </w:rPr>
-              <w:t xml:space="preserve"> </w:t>
-            </w:r>
-            <w:r>
-              <w:rPr>
-                <w:b w:val="0"/>
-                <w:bCs w:val="0"/>
-              </w:rPr>
-              <w:t>@</w:t>
-            </w:r>
-            <w:proofErr w:type="gramEnd"/>
-            <w:r>
-              <w:rPr>
-                <w:b w:val="0"/>
-                <w:bCs w:val="0"/>
-              </w:rPr>
-              <w:t xml:space="preserve"> 12 V</w:t>
+              <w:t>@ 12 V</w:t>
             </w:r>
           </w:p>
         </w:tc>
@@ -1270,30 +1254,14 @@
                 <w:b w:val="0"/>
                 <w:bCs w:val="0"/>
               </w:rPr>
-              <w:t xml:space="preserve">Temperature accuracy (NTC 10k </w:t>
-            </w:r>
-            <w:proofErr w:type="gramStart"/>
+              <w:t>Temperature accuracy (NTC 10k B3977)</w:t>
+            </w:r>
             <w:r>
               <w:rPr>
                 <w:b w:val="0"/>
                 <w:bCs w:val="0"/>
               </w:rPr>
-              <w:t>B3977)</w:t>
-            </w:r>
-            <w:r>
-              <w:rPr>
-                <w:b w:val="0"/>
-                <w:bCs w:val="0"/>
-              </w:rPr>
-              <w:t xml:space="preserve"> @</w:t>
-            </w:r>
-            <w:proofErr w:type="gramEnd"/>
-            <w:r>
-              <w:rPr>
-                <w:b w:val="0"/>
-                <w:bCs w:val="0"/>
-              </w:rPr>
-              <w:t xml:space="preserve"> 25 °C</w:t>
+              <w:t xml:space="preserve"> @ 25 °C</w:t>
             </w:r>
           </w:p>
         </w:tc>
@@ -1487,21 +1455,12 @@
                 <w:bCs w:val="0"/>
               </w:rPr>
             </w:pPr>
-            <w:proofErr w:type="spellStart"/>
             <w:r>
               <w:rPr>
                 <w:b w:val="0"/>
                 <w:bCs w:val="0"/>
               </w:rPr>
-              <w:t>RTDx</w:t>
-            </w:r>
-            <w:proofErr w:type="spellEnd"/>
-            <w:r>
-              <w:rPr>
-                <w:b w:val="0"/>
-                <w:bCs w:val="0"/>
-              </w:rPr>
-              <w:t xml:space="preserve"> pins voltage to GND-ISO</w:t>
+              <w:t>RTDx pins voltage to GND-ISO</w:t>
             </w:r>
           </w:p>
         </w:tc>
@@ -1606,23 +1565,7 @@
                 <w:b w:val="0"/>
                 <w:bCs w:val="0"/>
               </w:rPr>
-              <w:t xml:space="preserve">Current through </w:t>
-            </w:r>
-            <w:proofErr w:type="spellStart"/>
-            <w:r>
-              <w:rPr>
-                <w:b w:val="0"/>
-                <w:bCs w:val="0"/>
-              </w:rPr>
-              <w:t>RTDx</w:t>
-            </w:r>
-            <w:proofErr w:type="spellEnd"/>
-            <w:r>
-              <w:rPr>
-                <w:b w:val="0"/>
-                <w:bCs w:val="0"/>
-              </w:rPr>
-              <w:t xml:space="preserve"> port</w:t>
+              <w:t>Current through RTDx port</w:t>
             </w:r>
           </w:p>
         </w:tc>
@@ -1765,11 +1708,9 @@
             <w:r>
               <w:t xml:space="preserve"> bits, </w:t>
             </w:r>
-            <w:proofErr w:type="gramStart"/>
             <w:r>
               <w:t>Even</w:t>
             </w:r>
-            <w:proofErr w:type="gramEnd"/>
             <w:r>
               <w:t xml:space="preserve"> parity, 1 stop bit</w:t>
             </w:r>
@@ -1868,7 +1809,7 @@
           <w:noProof/>
         </w:rPr>
         <w:drawing>
-          <wp:inline distT="0" distB="0" distL="0" distR="0" wp14:anchorId="7025D756" wp14:editId="56DE5F47">
+          <wp:inline distT="0" distB="0" distL="0" distR="0" wp14:anchorId="7025D756" wp14:editId="370F890A">
             <wp:extent cx="3054851" cy="2711395"/>
             <wp:effectExtent l="0" t="0" r="0" b="0"/>
             <wp:docPr id="1353264226" name="Obrázek 19" descr="Obsah obrázku Elektronická součástka, Obvodoví součástka, Elektronické inženýrství, Pasivní součástka&#10;&#10;Obsah generovaný pomocí AI může být nesprávný."/>
@@ -2076,7 +2017,7 @@
           </mc:Choice>
           <mc:Fallback>
             <w:pict>
-              <v:shapetype w14:anchorId="0D23AC6F" id="_x0000_t88" coordsize="21600,21600" o:spt="88" adj="1800,10800" path="m,qx10800@0l10800@2qy21600@11,10800@3l10800@1qy,21600e" filled="f">
+              <v:shapetype w14:anchorId="6B582AB1" id="_x0000_t88" coordsize="21600,21600" o:spt="88" adj="1800,10800" path="m,qx10800@0l10800@2qy21600@11,10800@3l10800@1qy,21600e" filled="f">
                 <v:formulas>
                   <v:f eqn="val #0"/>
                   <v:f eqn="sum 21600 0 #0"/>
@@ -2789,7 +2730,7 @@
           </mc:Choice>
           <mc:Fallback>
             <w:pict>
-              <v:shapetype w14:anchorId="40A9394C" id="_x0000_t32" coordsize="21600,21600" o:spt="32" o:oned="t" path="m,l21600,21600e" filled="f">
+              <v:shapetype w14:anchorId="610B6638" id="_x0000_t32" coordsize="21600,21600" o:spt="32" o:oned="t" path="m,l21600,21600e" filled="f">
                 <v:path arrowok="t" fillok="f" o:connecttype="none"/>
                 <o:lock v:ext="edit" shapetype="t"/>
               </v:shapetype>
@@ -2864,7 +2805,7 @@
           </mc:Choice>
           <mc:Fallback>
             <w:pict>
-              <v:shape w14:anchorId="0D1B68E8" id="Přímá spojnice se šipkou 18" o:spid="_x0000_s1026" type="#_x0000_t32" style="position:absolute;margin-left:232.85pt;margin-top:216.9pt;width:0;height:31.4pt;flip:y;z-index:251505664;visibility:visible;mso-wrap-style:square;mso-wrap-distance-left:9pt;mso-wrap-distance-top:0;mso-wrap-distance-right:9pt;mso-wrap-distance-bottom:0;mso-position-horizontal:absolute;mso-position-horizontal-relative:text;mso-position-vertical:absolute;mso-position-vertical-relative:text" o:gfxdata="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" strokecolor="black [3213]">
+              <v:shape w14:anchorId="03333787" id="Přímá spojnice se šipkou 18" o:spid="_x0000_s1026" type="#_x0000_t32" style="position:absolute;margin-left:232.85pt;margin-top:216.9pt;width:0;height:31.4pt;flip:y;z-index:251505664;visibility:visible;mso-wrap-style:square;mso-wrap-distance-left:9pt;mso-wrap-distance-top:0;mso-wrap-distance-right:9pt;mso-wrap-distance-bottom:0;mso-position-horizontal:absolute;mso-position-horizontal-relative:text;mso-position-vertical:absolute;mso-position-vertical-relative:text" o:gfxdata="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" strokecolor="black [3213]">
                 <v:stroke dashstyle="3 1" endarrow="open"/>
               </v:shape>
             </w:pict>
@@ -2938,7 +2879,7 @@
           </mc:Choice>
           <mc:Fallback>
             <w:pict>
-              <v:shape w14:anchorId="1F622492" id="Přímá spojnice se šipkou 16" o:spid="_x0000_s1026" type="#_x0000_t32" style="position:absolute;margin-left:91.95pt;margin-top:29.45pt;width:41.75pt;height:0;z-index:251489280;visibility:visible;mso-wrap-style:square;mso-width-percent:0;mso-wrap-distance-left:9pt;mso-wrap-distance-top:0;mso-wrap-distance-right:9pt;mso-wrap-distance-bottom:0;mso-position-horizontal:absolute;mso-position-horizontal-relative:text;mso-position-vertical:absolute;mso-position-vertical-relative:text;mso-width-percent:0;mso-width-relative:margin" o:gfxdata="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" strokecolor="black [3213]">
+              <v:shape w14:anchorId="5FE2D5F5" id="Přímá spojnice se šipkou 16" o:spid="_x0000_s1026" type="#_x0000_t32" style="position:absolute;margin-left:91.95pt;margin-top:29.45pt;width:41.75pt;height:0;z-index:251489280;visibility:visible;mso-wrap-style:square;mso-width-percent:0;mso-wrap-distance-left:9pt;mso-wrap-distance-top:0;mso-wrap-distance-right:9pt;mso-wrap-distance-bottom:0;mso-position-horizontal:absolute;mso-position-horizontal-relative:text;mso-position-vertical:absolute;mso-position-vertical-relative:text;mso-width-percent:0;mso-width-relative:margin" o:gfxdata="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" strokecolor="black [3213]">
                 <v:stroke dashstyle="3 1" endarrow="open"/>
               </v:shape>
             </w:pict>
@@ -3012,7 +2953,7 @@
           </mc:Choice>
           <mc:Fallback>
             <w:pict>
-              <v:shape w14:anchorId="0A5E1384" id="Přímá spojnice se šipkou 16" o:spid="_x0000_s1026" type="#_x0000_t32" style="position:absolute;margin-left:92pt;margin-top:172.3pt;width:41.75pt;height:0;z-index:251487232;visibility:visible;mso-wrap-style:square;mso-width-percent:0;mso-wrap-distance-left:9pt;mso-wrap-distance-top:0;mso-wrap-distance-right:9pt;mso-wrap-distance-bottom:0;mso-position-horizontal:absolute;mso-position-horizontal-relative:text;mso-position-vertical:absolute;mso-position-vertical-relative:text;mso-width-percent:0;mso-width-relative:margin" o:gfxdata="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" strokecolor="black [3213]">
+              <v:shape w14:anchorId="0A53CB19" id="Přímá spojnice se šipkou 16" o:spid="_x0000_s1026" type="#_x0000_t32" style="position:absolute;margin-left:92pt;margin-top:172.3pt;width:41.75pt;height:0;z-index:251487232;visibility:visible;mso-wrap-style:square;mso-width-percent:0;mso-wrap-distance-left:9pt;mso-wrap-distance-top:0;mso-wrap-distance-right:9pt;mso-wrap-distance-bottom:0;mso-position-horizontal:absolute;mso-position-horizontal-relative:text;mso-position-vertical:absolute;mso-position-vertical-relative:text;mso-width-percent:0;mso-width-relative:margin" o:gfxdata="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" strokecolor="black [3213]">
                 <v:stroke dashstyle="3 1" endarrow="open"/>
               </v:shape>
             </w:pict>
@@ -3086,7 +3027,7 @@
           </mc:Choice>
           <mc:Fallback>
             <w:pict>
-              <v:shape w14:anchorId="40E60AFB" id="Přímá spojnice se šipkou 16" o:spid="_x0000_s1026" type="#_x0000_t32" style="position:absolute;margin-left:92.1pt;margin-top:132.2pt;width:41.75pt;height:0;z-index:251485184;visibility:visible;mso-wrap-style:square;mso-width-percent:0;mso-wrap-distance-left:9pt;mso-wrap-distance-top:0;mso-wrap-distance-right:9pt;mso-wrap-distance-bottom:0;mso-position-horizontal:absolute;mso-position-horizontal-relative:text;mso-position-vertical:absolute;mso-position-vertical-relative:text;mso-width-percent:0;mso-width-relative:margin" o:gfxdata="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" strokecolor="black [3213]">
+              <v:shape w14:anchorId="6B043C9E" id="Přímá spojnice se šipkou 16" o:spid="_x0000_s1026" type="#_x0000_t32" style="position:absolute;margin-left:92.1pt;margin-top:132.2pt;width:41.75pt;height:0;z-index:251485184;visibility:visible;mso-wrap-style:square;mso-width-percent:0;mso-wrap-distance-left:9pt;mso-wrap-distance-top:0;mso-wrap-distance-right:9pt;mso-wrap-distance-bottom:0;mso-position-horizontal:absolute;mso-position-horizontal-relative:text;mso-position-vertical:absolute;mso-position-vertical-relative:text;mso-width-percent:0;mso-width-relative:margin" o:gfxdata="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" strokecolor="black [3213]">
                 <v:stroke dashstyle="3 1" endarrow="open"/>
               </v:shape>
             </w:pict>
@@ -4228,53 +4169,28 @@
           </w:p>
           <w:p>
             <w:r>
-              <w:t>ADDRESS 0</w:t>
-            </w:r>
-            <w:proofErr w:type="gramStart"/>
-            <w:r>
-              <w:t>:  1</w:t>
-            </w:r>
-            <w:proofErr w:type="gramEnd"/>
-          </w:p>
-          <w:p>
-            <w:r>
-              <w:t>ADDRESS 1</w:t>
-            </w:r>
-            <w:proofErr w:type="gramStart"/>
-            <w:r>
-              <w:t>:  2</w:t>
-            </w:r>
-            <w:proofErr w:type="gramEnd"/>
-          </w:p>
-          <w:p>
-            <w:r>
-              <w:t>ADDRESS 2</w:t>
-            </w:r>
-            <w:proofErr w:type="gramStart"/>
-            <w:r>
-              <w:t>:  4</w:t>
-            </w:r>
-            <w:proofErr w:type="gramEnd"/>
-          </w:p>
-          <w:p>
-            <w:r>
-              <w:t>ADDRESS 3</w:t>
-            </w:r>
-            <w:proofErr w:type="gramStart"/>
-            <w:r>
-              <w:t>:  8</w:t>
-            </w:r>
-            <w:proofErr w:type="gramEnd"/>
-          </w:p>
-          <w:p>
-            <w:r>
-              <w:t>ADDRESS 4</w:t>
-            </w:r>
-            <w:proofErr w:type="gramStart"/>
-            <w:r>
-              <w:t>:  16</w:t>
-            </w:r>
-            <w:proofErr w:type="gramEnd"/>
+              <w:t>ADDRESS 0:  1</w:t>
+            </w:r>
+          </w:p>
+          <w:p>
+            <w:r>
+              <w:t>ADDRESS 1:  2</w:t>
+            </w:r>
+          </w:p>
+          <w:p>
+            <w:r>
+              <w:t>ADDRESS 2:  4</w:t>
+            </w:r>
+          </w:p>
+          <w:p>
+            <w:r>
+              <w:t>ADDRESS 3:  8</w:t>
+            </w:r>
+          </w:p>
+          <w:p>
+            <w:r>
+              <w:t>ADDRESS 4:  16</w:t>
+            </w:r>
           </w:p>
           <w:p>
             <w:r>
@@ -4403,7 +4319,7 @@
           </mc:Choice>
           <mc:Fallback>
             <w:pict>
-              <v:shape w14:anchorId="60740672" id="Přímá spojnice se šipkou 17" o:spid="_x0000_s1026" type="#_x0000_t32" style="position:absolute;margin-left:382.7pt;margin-top:152.15pt;width:30.25pt;height:0;flip:x;z-index:251584512;visibility:visible;mso-wrap-style:square;mso-width-percent:0;mso-height-percent:0;mso-wrap-distance-left:9pt;mso-wrap-distance-top:0;mso-wrap-distance-right:9pt;mso-wrap-distance-bottom:0;mso-position-horizontal:absolute;mso-position-horizontal-relative:text;mso-position-vertical:absolute;mso-position-vertical-relative:text;mso-width-percent:0;mso-height-percent:0;mso-width-relative:margin;mso-height-relative:margin" o:gfxdata="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" strokecolor="black [3213]">
+              <v:shape w14:anchorId="0E44B34C" id="Přímá spojnice se šipkou 17" o:spid="_x0000_s1026" type="#_x0000_t32" style="position:absolute;margin-left:382.7pt;margin-top:152.15pt;width:30.25pt;height:0;flip:x;z-index:251584512;visibility:visible;mso-wrap-style:square;mso-width-percent:0;mso-height-percent:0;mso-wrap-distance-left:9pt;mso-wrap-distance-top:0;mso-wrap-distance-right:9pt;mso-wrap-distance-bottom:0;mso-position-horizontal:absolute;mso-position-horizontal-relative:text;mso-position-vertical:absolute;mso-position-vertical-relative:text;mso-width-percent:0;mso-height-percent:0;mso-width-relative:margin;mso-height-relative:margin" o:gfxdata="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" strokecolor="black [3213]">
                 <v:stroke dashstyle="3 1" endarrow="open"/>
               </v:shape>
             </w:pict>
@@ -4480,7 +4396,7 @@
           </mc:Choice>
           <mc:Fallback>
             <w:pict>
-              <v:shape w14:anchorId="636DD95A" id="Přímá spojnice se šipkou 16" o:spid="_x0000_s1026" type="#_x0000_t32" style="position:absolute;margin-left:110.25pt;margin-top:177.85pt;width:38.1pt;height:0;z-index:251845632;visibility:visible;mso-wrap-style:square;mso-width-percent:0;mso-height-percent:0;mso-wrap-distance-left:9pt;mso-wrap-distance-top:0;mso-wrap-distance-right:9pt;mso-wrap-distance-bottom:0;mso-position-horizontal:absolute;mso-position-horizontal-relative:text;mso-position-vertical:absolute;mso-position-vertical-relative:text;mso-width-percent:0;mso-height-percent:0;mso-width-relative:margin;mso-height-relative:margin" o:gfxdata="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" strokecolor="black [3213]">
+              <v:shape w14:anchorId="5287B1A4" id="Přímá spojnice se šipkou 16" o:spid="_x0000_s1026" type="#_x0000_t32" style="position:absolute;margin-left:110.25pt;margin-top:177.85pt;width:38.1pt;height:0;z-index:251845632;visibility:visible;mso-wrap-style:square;mso-width-percent:0;mso-height-percent:0;mso-wrap-distance-left:9pt;mso-wrap-distance-top:0;mso-wrap-distance-right:9pt;mso-wrap-distance-bottom:0;mso-position-horizontal:absolute;mso-position-horizontal-relative:text;mso-position-vertical:absolute;mso-position-vertical-relative:text;mso-width-percent:0;mso-height-percent:0;mso-width-relative:margin;mso-height-relative:margin" o:gfxdata="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" strokecolor="black [3213]">
                 <v:stroke dashstyle="3 1" endarrow="open"/>
               </v:shape>
             </w:pict>
@@ -4557,7 +4473,7 @@
           </mc:Choice>
           <mc:Fallback>
             <w:pict>
-              <v:shape w14:anchorId="38A5687A" id="Pravá složená závorka 17" o:spid="_x0000_s1026" type="#_x0000_t88" style="position:absolute;margin-left:197.2pt;margin-top:217.4pt;width:3.55pt;height:16.6pt;rotation:90;z-index:251692032;visibility:visible;mso-wrap-style:square;mso-height-percent:0;mso-wrap-distance-left:9pt;mso-wrap-distance-top:0;mso-wrap-distance-right:9pt;mso-wrap-distance-bottom:0;mso-position-horizontal:absolute;mso-position-horizontal-relative:text;mso-position-vertical:absolute;mso-position-vertical-relative:text;mso-height-percent:0;mso-height-relative:margin;v-text-anchor:middle" o:gfxdata="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" adj="385" strokecolor="black [3213]"/>
+              <v:shape w14:anchorId="0ADF603F" id="Pravá složená závorka 17" o:spid="_x0000_s1026" type="#_x0000_t88" style="position:absolute;margin-left:197.2pt;margin-top:217.4pt;width:3.55pt;height:16.6pt;rotation:90;z-index:251692032;visibility:visible;mso-wrap-style:square;mso-height-percent:0;mso-wrap-distance-left:9pt;mso-wrap-distance-top:0;mso-wrap-distance-right:9pt;mso-wrap-distance-bottom:0;mso-position-horizontal:absolute;mso-position-horizontal-relative:text;mso-position-vertical:absolute;mso-position-vertical-relative:text;mso-height-percent:0;mso-height-relative:margin;v-text-anchor:middle" o:gfxdata="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" adj="385" strokecolor="black [3213]"/>
             </w:pict>
           </mc:Fallback>
         </mc:AlternateContent>
@@ -4632,7 +4548,7 @@
           </mc:Choice>
           <mc:Fallback>
             <w:pict>
-              <v:shape w14:anchorId="12D8CD2C" id="Pravá složená závorka 17" o:spid="_x0000_s1026" type="#_x0000_t88" style="position:absolute;margin-left:227.3pt;margin-top:217.45pt;width:3.55pt;height:16.6pt;rotation:90;z-index:251728896;visibility:visible;mso-wrap-style:square;mso-height-percent:0;mso-wrap-distance-left:9pt;mso-wrap-distance-top:0;mso-wrap-distance-right:9pt;mso-wrap-distance-bottom:0;mso-position-horizontal:absolute;mso-position-horizontal-relative:text;mso-position-vertical:absolute;mso-position-vertical-relative:text;mso-height-percent:0;mso-height-relative:margin;v-text-anchor:middle" o:gfxdata="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" adj="385" strokecolor="black [3213]"/>
+              <v:shape w14:anchorId="7BC6C26B" id="Pravá složená závorka 17" o:spid="_x0000_s1026" type="#_x0000_t88" style="position:absolute;margin-left:227.3pt;margin-top:217.45pt;width:3.55pt;height:16.6pt;rotation:90;z-index:251728896;visibility:visible;mso-wrap-style:square;mso-height-percent:0;mso-wrap-distance-left:9pt;mso-wrap-distance-top:0;mso-wrap-distance-right:9pt;mso-wrap-distance-bottom:0;mso-position-horizontal:absolute;mso-position-horizontal-relative:text;mso-position-vertical:absolute;mso-position-vertical-relative:text;mso-height-percent:0;mso-height-relative:margin;v-text-anchor:middle" o:gfxdata="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" adj="385" strokecolor="black [3213]"/>
             </w:pict>
           </mc:Fallback>
         </mc:AlternateContent>
@@ -4707,7 +4623,7 @@
           </mc:Choice>
           <mc:Fallback>
             <w:pict>
-              <v:shape w14:anchorId="27DF89D3" id="Pravá složená závorka 17" o:spid="_x0000_s1026" type="#_x0000_t88" style="position:absolute;margin-left:256.75pt;margin-top:217.45pt;width:3.55pt;height:16.6pt;rotation:90;z-index:251764736;visibility:visible;mso-wrap-style:square;mso-height-percent:0;mso-wrap-distance-left:9pt;mso-wrap-distance-top:0;mso-wrap-distance-right:9pt;mso-wrap-distance-bottom:0;mso-position-horizontal:absolute;mso-position-horizontal-relative:text;mso-position-vertical:absolute;mso-position-vertical-relative:text;mso-height-percent:0;mso-height-relative:margin;v-text-anchor:middle" o:gfxdata="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" adj="385" strokecolor="black [3213]"/>
+              <v:shape w14:anchorId="31F8EF10" id="Pravá složená závorka 17" o:spid="_x0000_s1026" type="#_x0000_t88" style="position:absolute;margin-left:256.75pt;margin-top:217.45pt;width:3.55pt;height:16.6pt;rotation:90;z-index:251764736;visibility:visible;mso-wrap-style:square;mso-height-percent:0;mso-wrap-distance-left:9pt;mso-wrap-distance-top:0;mso-wrap-distance-right:9pt;mso-wrap-distance-bottom:0;mso-position-horizontal:absolute;mso-position-horizontal-relative:text;mso-position-vertical:absolute;mso-position-vertical-relative:text;mso-height-percent:0;mso-height-relative:margin;v-text-anchor:middle" o:gfxdata="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" adj="385" strokecolor="black [3213]"/>
             </w:pict>
           </mc:Fallback>
         </mc:AlternateContent>
@@ -4782,7 +4698,7 @@
           </mc:Choice>
           <mc:Fallback>
             <w:pict>
-              <v:shape w14:anchorId="04FE3AE4" id="Pravá složená závorka 17" o:spid="_x0000_s1026" type="#_x0000_t88" style="position:absolute;margin-left:286.75pt;margin-top:217.45pt;width:3.55pt;height:16.6pt;rotation:90;z-index:251800576;visibility:visible;mso-wrap-style:square;mso-height-percent:0;mso-wrap-distance-left:9pt;mso-wrap-distance-top:0;mso-wrap-distance-right:9pt;mso-wrap-distance-bottom:0;mso-position-horizontal:absolute;mso-position-horizontal-relative:text;mso-position-vertical:absolute;mso-position-vertical-relative:text;mso-height-percent:0;mso-height-relative:margin;v-text-anchor:middle" o:gfxdata="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" adj="385" strokecolor="black [3213]"/>
+              <v:shape w14:anchorId="524B4A4A" id="Pravá složená závorka 17" o:spid="_x0000_s1026" type="#_x0000_t88" style="position:absolute;margin-left:286.75pt;margin-top:217.45pt;width:3.55pt;height:16.6pt;rotation:90;z-index:251800576;visibility:visible;mso-wrap-style:square;mso-height-percent:0;mso-wrap-distance-left:9pt;mso-wrap-distance-top:0;mso-wrap-distance-right:9pt;mso-wrap-distance-bottom:0;mso-position-horizontal:absolute;mso-position-horizontal-relative:text;mso-position-vertical:absolute;mso-position-vertical-relative:text;mso-height-percent:0;mso-height-relative:margin;v-text-anchor:middle" o:gfxdata="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" adj="385" strokecolor="black [3213]"/>
             </w:pict>
           </mc:Fallback>
         </mc:AlternateContent>
@@ -4857,7 +4773,7 @@
           </mc:Choice>
           <mc:Fallback>
             <w:pict>
-              <v:shape w14:anchorId="332435E2" id="Pravá složená závorka 17" o:spid="_x0000_s1026" type="#_x0000_t88" style="position:absolute;margin-left:317.35pt;margin-top:217.5pt;width:3.6pt;height:16.6pt;rotation:90;z-index:251834368;visibility:visible;mso-wrap-style:square;mso-height-percent:0;mso-wrap-distance-left:9pt;mso-wrap-distance-top:0;mso-wrap-distance-right:9pt;mso-wrap-distance-bottom:0;mso-position-horizontal:absolute;mso-position-horizontal-relative:text;mso-position-vertical:absolute;mso-position-vertical-relative:text;mso-height-percent:0;mso-height-relative:margin;v-text-anchor:middle" o:gfxdata="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" adj="390" strokecolor="black [3213]"/>
+              <v:shape w14:anchorId="3E5DF6A1" id="Pravá složená závorka 17" o:spid="_x0000_s1026" type="#_x0000_t88" style="position:absolute;margin-left:317.35pt;margin-top:217.5pt;width:3.6pt;height:16.6pt;rotation:90;z-index:251834368;visibility:visible;mso-wrap-style:square;mso-height-percent:0;mso-wrap-distance-left:9pt;mso-wrap-distance-top:0;mso-wrap-distance-right:9pt;mso-wrap-distance-bottom:0;mso-position-horizontal:absolute;mso-position-horizontal-relative:text;mso-position-vertical:absolute;mso-position-vertical-relative:text;mso-height-percent:0;mso-height-relative:margin;v-text-anchor:middle" o:gfxdata="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" adj="390" strokecolor="black [3213]"/>
             </w:pict>
           </mc:Fallback>
         </mc:AlternateContent>
@@ -5478,15 +5394,7 @@
                                 <w:sz w:val="20"/>
                                 <w:szCs w:val="20"/>
                               </w:rPr>
-                              <w:t>RTD connector</w:t>
-                            </w:r>
-                            <w:r>
-                              <w:rPr>
-                                <w:rFonts w:ascii="Arial Narrow" w:hAnsi="Arial Narrow"/>
-                                <w:sz w:val="20"/>
-                                <w:szCs w:val="20"/>
-                              </w:rPr>
-                              <w:t xml:space="preserve">  </w:t>
+                              <w:t xml:space="preserve">RTD connector  </w:t>
                             </w:r>
                             <w:r>
                               <w:rPr>
@@ -5495,16 +5403,7 @@
                                 <w:sz w:val="20"/>
                                 <w:szCs w:val="20"/>
                               </w:rPr>
-                              <w:t>CH</w:t>
-                            </w:r>
-                            <w:r>
-                              <w:rPr>
-                                <w:rFonts w:ascii="Arial Narrow" w:hAnsi="Arial Narrow"/>
-                                <w:color w:val="F79646" w:themeColor="accent6"/>
-                                <w:sz w:val="20"/>
-                                <w:szCs w:val="20"/>
-                              </w:rPr>
-                              <w:t xml:space="preserve">1 </w:t>
+                              <w:t xml:space="preserve">CH1 </w:t>
                             </w:r>
                             <w:r>
                               <w:rPr>
@@ -5603,16 +5502,7 @@
                                 <w:sz w:val="20"/>
                                 <w:szCs w:val="20"/>
                               </w:rPr>
-                              <w:t xml:space="preserve"> </w:t>
-                            </w:r>
-                            <w:r>
-                              <w:rPr>
-                                <w:rFonts w:ascii="Arial Narrow" w:hAnsi="Arial Narrow"/>
-                                <w:color w:val="F79646" w:themeColor="accent6"/>
-                                <w:sz w:val="20"/>
-                                <w:szCs w:val="20"/>
-                              </w:rPr>
-                              <w:t>GND-ISO</w:t>
+                              <w:t xml:space="preserve"> GND-ISO</w:t>
                             </w:r>
                           </w:p>
                         </w:txbxContent>
@@ -5655,15 +5545,7 @@
                           <w:sz w:val="20"/>
                           <w:szCs w:val="20"/>
                         </w:rPr>
-                        <w:t>RTD connector</w:t>
-                      </w:r>
-                      <w:r>
-                        <w:rPr>
-                          <w:rFonts w:ascii="Arial Narrow" w:hAnsi="Arial Narrow"/>
-                          <w:sz w:val="20"/>
-                          <w:szCs w:val="20"/>
-                        </w:rPr>
-                        <w:t xml:space="preserve">  </w:t>
+                        <w:t xml:space="preserve">RTD connector  </w:t>
                       </w:r>
                       <w:r>
                         <w:rPr>
@@ -5672,16 +5554,7 @@
                           <w:sz w:val="20"/>
                           <w:szCs w:val="20"/>
                         </w:rPr>
-                        <w:t>CH</w:t>
-                      </w:r>
-                      <w:r>
-                        <w:rPr>
-                          <w:rFonts w:ascii="Arial Narrow" w:hAnsi="Arial Narrow"/>
-                          <w:color w:val="F79646" w:themeColor="accent6"/>
-                          <w:sz w:val="20"/>
-                          <w:szCs w:val="20"/>
-                        </w:rPr>
-                        <w:t xml:space="preserve">1 </w:t>
+                        <w:t xml:space="preserve">CH1 </w:t>
                       </w:r>
                       <w:r>
                         <w:rPr>
@@ -5780,16 +5653,7 @@
                           <w:sz w:val="20"/>
                           <w:szCs w:val="20"/>
                         </w:rPr>
-                        <w:t xml:space="preserve"> </w:t>
-                      </w:r>
-                      <w:r>
-                        <w:rPr>
-                          <w:rFonts w:ascii="Arial Narrow" w:hAnsi="Arial Narrow"/>
-                          <w:color w:val="F79646" w:themeColor="accent6"/>
-                          <w:sz w:val="20"/>
-                          <w:szCs w:val="20"/>
-                        </w:rPr>
-                        <w:t>GND-ISO</w:t>
+                        <w:t xml:space="preserve"> GND-ISO</w:t>
                       </w:r>
                     </w:p>
                   </w:txbxContent>
@@ -5924,19 +5788,7 @@
           </w:tcPr>
           <w:p>
             <w:r>
-              <w:t xml:space="preserve">Port for RTD emulation. </w:t>
-            </w:r>
-            <w:r>
-              <w:t>P</w:t>
-            </w:r>
-            <w:r>
-              <w:t>ins are interchangeable. Voltage at pin</w:t>
-            </w:r>
-            <w:r>
-              <w:t>s</w:t>
-            </w:r>
-            <w:r>
-              <w:t xml:space="preserve"> must not exceed working range 0 – 3.5 V</w:t>
+              <w:t>Port for RTD emulation. Pins are interchangeable. Voltage at pins must not exceed working range 0 – 3.5 V</w:t>
             </w:r>
           </w:p>
         </w:tc>
@@ -6064,13 +5916,7 @@
               <w:jc w:val="center"/>
             </w:pPr>
             <w:r>
-              <w:t>E</w:t>
-            </w:r>
-            <w:r>
-              <w:t>2</w:t>
-            </w:r>
-            <w:r>
-              <w:t xml:space="preserve"> | A2 – A0</w:t>
+              <w:t>E2 | A2 – A0</w:t>
             </w:r>
           </w:p>
           <w:p>
@@ -6184,21 +6030,7 @@
           <w:b/>
           <w:bCs w:val="0"/>
         </w:rPr>
-        <w:t>always connect the top-side connector of one board to the bottom-side connector</w:t>
-      </w:r>
-      <w:r>
-        <w:rPr>
-          <w:b/>
-          <w:bCs w:val="0"/>
-        </w:rPr>
-        <w:t xml:space="preserve"> </w:t>
-      </w:r>
-      <w:r>
-        <w:rPr>
-          <w:b/>
-          <w:bCs w:val="0"/>
-        </w:rPr>
-        <w:t>of the other board</w:t>
+        <w:t>always connect the top-side connector of one board to the bottom-side connector of the other board</w:t>
       </w:r>
       <w:r>
         <w:t>.</w:t>
@@ -6206,13 +6038,7 @@
     </w:p>
     <w:p>
       <w:r>
-        <w:t xml:space="preserve">Incorrect orientation may </w:t>
-      </w:r>
-      <w:r>
-        <w:t>cause</w:t>
-      </w:r>
-      <w:r>
-        <w:t xml:space="preserve"> damage.</w:t>
+        <w:t>Incorrect orientation may cause damage.</w:t>
       </w:r>
     </w:p>
     <w:p/>
@@ -6225,7 +6051,7 @@
           <w:noProof/>
         </w:rPr>
         <w:drawing>
-          <wp:inline distT="0" distB="0" distL="0" distR="0" wp14:anchorId="7B563D16" wp14:editId="3CE63394">
+          <wp:inline distT="0" distB="0" distL="0" distR="0" wp14:anchorId="7B563D16" wp14:editId="1AF7FF72">
             <wp:extent cx="1932623" cy="2819098"/>
             <wp:effectExtent l="0" t="5080" r="5715" b="5715"/>
             <wp:docPr id="376782408" name="Obrázek 18" descr="Obsah obrázku elektronika, stroj/přístroj, interiér, zeď&#10;&#10;Obsah generovaný pomocí AI může být nesprávný."/>
@@ -8876,15 +8702,7 @@
         <w:t xml:space="preserve"> after writing the </w:t>
       </w:r>
       <w:r>
-        <w:t xml:space="preserve">“Apply </w:t>
-      </w:r>
-      <w:proofErr w:type="spellStart"/>
-      <w:r>
-        <w:t>modbus</w:t>
-      </w:r>
-      <w:proofErr w:type="spellEnd"/>
-      <w:r>
-        <w:t xml:space="preserve"> parameters” </w:t>
+        <w:t xml:space="preserve">“Apply modbus parameters” </w:t>
       </w:r>
       <w:r>
         <w:t>register.</w:t>
@@ -9946,13 +9764,7 @@
     </w:p>
     <w:p>
       <w:r>
-        <w:t xml:space="preserve">The RTD Emulator is composed of two galvanically isolated parts. The Controller part contains the RS485 transceiver, power supply stabilizer, and microcontroller. The RTD part is isolated by an I²C isolator and a DC-to-DC power supply. The RTD channel is galvanically referenced to the common isolated ground (GND-ISO). In most applications, this GND-ISO must be connected to the ground of the device that measures </w:t>
-      </w:r>
-      <w:r>
-        <w:t>emulated</w:t>
-      </w:r>
-      <w:r>
-        <w:t xml:space="preserve"> resistance.</w:t>
+        <w:t>The RTD Emulator is composed of two galvanically isolated parts. The Controller part contains the RS485 transceiver, power supply stabilizer, and microcontroller. The RTD part is isolated by an I²C isolator and a DC-to-DC power supply. The RTD channel is galvanically referenced to the common isolated ground (GND-ISO). In most applications, this GND-ISO must be connected to the ground of the device that measures emulated resistance.</w:t>
       </w:r>
     </w:p>
     <w:p>
@@ -10378,19 +10190,7 @@
         <w:rPr>
           <w:lang w:val="en-GB"/>
         </w:rPr>
-        <w:t>To enable slew rate mode, write Value 1 (Slew rate on) to register</w:t>
-      </w:r>
-      <w:r>
-        <w:rPr>
-          <w:lang w:val="en-GB"/>
-        </w:rPr>
-        <w:t xml:space="preserve"> </w:t>
-      </w:r>
-      <w:r>
-        <w:rPr>
-          <w:lang w:val="en-GB"/>
-        </w:rPr>
-        <w:t>– Temperature slew rate mode.</w:t>
+        <w:t>To enable slew rate mode, write Value 1 (Slew rate on) to register – Temperature slew rate mode.</w:t>
       </w:r>
     </w:p>
     <w:p>
@@ -10639,13 +10439,7 @@
         <w:rPr>
           <w:lang w:val="en-GB"/>
         </w:rPr>
-        <w:t xml:space="preserve">5. </w:t>
-      </w:r>
-      <w:r>
-        <w:rPr>
-          <w:lang w:val="en-GB"/>
-        </w:rPr>
-        <w:t>Write value 1000 to the Platinum stock resistance register.</w:t>
+        <w:t>5. Write value 1000 to the Platinum stock resistance register.</w:t>
       </w:r>
     </w:p>
     <w:p>
@@ -10659,13 +10453,7 @@
         <w:rPr>
           <w:lang w:val="en-GB"/>
         </w:rPr>
-        <w:t xml:space="preserve">6. </w:t>
-      </w:r>
-      <w:r>
-        <w:rPr>
-          <w:lang w:val="en-GB"/>
-        </w:rPr>
-        <w:t>Write the desired temperature to the Set temperature register for standard operation.</w:t>
+        <w:t>6. Write the desired temperature to the Set temperature register for standard operation.</w:t>
       </w:r>
     </w:p>
     <w:p>
@@ -10679,13 +10467,7 @@
         <w:rPr>
           <w:lang w:val="en-GB"/>
         </w:rPr>
-        <w:t xml:space="preserve">7. </w:t>
-      </w:r>
-      <w:r>
-        <w:rPr>
-          <w:lang w:val="en-GB"/>
-        </w:rPr>
-        <w:t>To enable slew rate mode, write Value 1 (Slew rate on) to register 113 – Temperature slew rate mode.</w:t>
+        <w:t>7. To enable slew rate mode, write Value 1 (Slew rate on) to register 113 – Temperature slew rate mode.</w:t>
       </w:r>
     </w:p>
     <w:p>
@@ -10945,8 +10727,86 @@
     <w:p/>
     <w:p>
       <w:bookmarkStart w:id="3" w:name="_Hlk48224814"/>
-      <w:r>
-        <w:t>If more than two expansion boards are connected (up to a maximum of four), simply update the corresponding expansion board addresses in the configuration.</w:t>
+    </w:p>
+    <w:p/>
+    <w:p>
+      <w:pPr>
+        <w:rPr>
+          <w:lang w:val="en-GB"/>
+        </w:rPr>
+      </w:pPr>
+      <w:r>
+        <w:rPr>
+          <w:b/>
+          <w:lang w:val="en-GB"/>
+        </w:rPr>
+        <w:lastRenderedPageBreak/>
+        <w:t>Note</w:t>
+      </w:r>
+      <w:r>
+        <w:rPr>
+          <w:b/>
+          <w:lang w:val="en-GB"/>
+        </w:rPr>
+        <w:t xml:space="preserve"> 1</w:t>
+      </w:r>
+      <w:r>
+        <w:rPr>
+          <w:b/>
+          <w:lang w:val="en-GB"/>
+        </w:rPr>
+        <w:t>:</w:t>
+      </w:r>
+      <w:r>
+        <w:rPr>
+          <w:lang w:val="en-GB"/>
+        </w:rPr>
+        <w:t xml:space="preserve"> To reset the slew rate, simply toggle the setting in register</w:t>
+      </w:r>
+      <w:r>
+        <w:rPr>
+          <w:lang w:val="en-GB"/>
+        </w:rPr>
+        <w:t xml:space="preserve"> -</w:t>
+      </w:r>
+      <w:r>
+        <w:rPr>
+          <w:lang w:val="en-GB"/>
+        </w:rPr>
+        <w:t xml:space="preserve"> Temp slew rate mode (set to 0 = off, then back to 1 = on).</w:t>
+      </w:r>
+    </w:p>
+    <w:p>
+      <w:pPr>
+        <w:rPr>
+          <w:lang w:val="en-GB"/>
+        </w:rPr>
+      </w:pPr>
+    </w:p>
+    <w:p>
+      <w:pPr>
+        <w:rPr>
+          <w:lang w:val="en-GB"/>
+        </w:rPr>
+      </w:pPr>
+      <w:r>
+        <w:rPr>
+          <w:b/>
+          <w:lang w:val="en-GB"/>
+        </w:rPr>
+        <w:t>Note 2:</w:t>
+      </w:r>
+      <w:r>
+        <w:rPr>
+          <w:lang w:val="en-GB"/>
+        </w:rPr>
+        <w:t xml:space="preserve"> If</w:t>
+      </w:r>
+      <w:r>
+        <w:rPr>
+          <w:lang w:val="en-GB"/>
+        </w:rPr>
+        <w:t xml:space="preserve"> more than two expansion boards are connected (up to a maximum of four), simply update the corresponding expansion board addresses in the configuration.</w:t>
       </w:r>
     </w:p>
     <w:p>
@@ -10960,7 +10820,6 @@
         <w:rPr>
           <w:lang w:val="en-GB"/>
         </w:rPr>
-        <w:lastRenderedPageBreak/>
         <w:t xml:space="preserve">Device </w:t>
       </w:r>
       <w:r>
@@ -11261,6 +11120,7 @@
               <w:jc w:val="left"/>
             </w:pPr>
             <w:r>
+              <w:lastRenderedPageBreak/>
               <w:t>Revision number</w:t>
             </w:r>
           </w:p>
@@ -11683,7 +11543,7 @@
         </mc:Choice>
         <mc:Fallback>
           <w:pict>
-            <v:line w14:anchorId="603C766B" id="Přímá spojnice 2" o:spid="_x0000_s1026" style="position:absolute;z-index:251657216;visibility:visible;mso-wrap-style:square;mso-width-percent:0;mso-wrap-distance-left:9pt;mso-wrap-distance-top:0;mso-wrap-distance-right:9pt;mso-wrap-distance-bottom:0;mso-position-horizontal:absolute;mso-position-horizontal-relative:text;mso-position-vertical:absolute;mso-position-vertical-relative:text;mso-width-percent:0;mso-width-relative:margin" from="0,-.05pt" to="506pt,-.05pt" o:gfxdata="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" strokecolor="#f68c36 [3049]" strokeweight="1pt"/>
+            <v:line w14:anchorId="6336FCC8" id="Přímá spojnice 2" o:spid="_x0000_s1026" style="position:absolute;z-index:251657216;visibility:visible;mso-wrap-style:square;mso-width-percent:0;mso-wrap-distance-left:9pt;mso-wrap-distance-top:0;mso-wrap-distance-right:9pt;mso-wrap-distance-bottom:0;mso-position-horizontal:absolute;mso-position-horizontal-relative:text;mso-position-vertical:absolute;mso-position-vertical-relative:text;mso-width-percent:0;mso-width-relative:margin" from="0,-.05pt" to="506pt,-.05pt" o:gfxdata="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" strokecolor="#f68c36 [3049]" strokeweight="1pt"/>
           </w:pict>
         </mc:Fallback>
       </mc:AlternateContent>
@@ -11807,7 +11667,7 @@
         </mc:Choice>
         <mc:Fallback>
           <w:pict>
-            <v:line w14:anchorId="0410CC85" id="Přímá spojnice 9" o:spid="_x0000_s1026" style="position:absolute;z-index:251691008;visibility:visible;mso-wrap-style:square;mso-width-percent:0;mso-wrap-distance-left:9pt;mso-wrap-distance-top:0;mso-wrap-distance-right:9pt;mso-wrap-distance-bottom:0;mso-position-horizontal:absolute;mso-position-horizontal-relative:text;mso-position-vertical:absolute;mso-position-vertical-relative:text;mso-width-percent:0;mso-width-relative:margin" from="0,-.05pt" to="506pt,-.05pt" o:gfxdata="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" strokecolor="#f68c36 [3049]" strokeweight="1pt"/>
+            <v:line w14:anchorId="689A6AC6" id="Přímá spojnice 9" o:spid="_x0000_s1026" style="position:absolute;z-index:251691008;visibility:visible;mso-wrap-style:square;mso-width-percent:0;mso-wrap-distance-left:9pt;mso-wrap-distance-top:0;mso-wrap-distance-right:9pt;mso-wrap-distance-bottom:0;mso-position-horizontal:absolute;mso-position-horizontal-relative:text;mso-position-vertical:absolute;mso-position-vertical-relative:text;mso-width-percent:0;mso-width-relative:margin" from="0,-.05pt" to="506pt,-.05pt" o:gfxdata="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" strokecolor="#f68c36 [3049]" strokeweight="1pt"/>
           </w:pict>
         </mc:Fallback>
       </mc:AlternateContent>
@@ -11897,7 +11757,7 @@
         </mc:Choice>
         <mc:Fallback>
           <w:pict>
-            <v:line w14:anchorId="0809FF50" id="Přímá spojnice 11" o:spid="_x0000_s1026" style="position:absolute;z-index:251670016;visibility:visible;mso-wrap-style:square;mso-width-percent:0;mso-wrap-distance-left:9pt;mso-wrap-distance-top:0;mso-wrap-distance-right:9pt;mso-wrap-distance-bottom:0;mso-position-horizontal:absolute;mso-position-horizontal-relative:text;mso-position-vertical:absolute;mso-position-vertical-relative:text;mso-width-percent:0;mso-width-relative:margin" from="-.55pt,16.1pt" to="476.95pt,16.1pt" o:gfxdata="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" strokecolor="#f68c36 [3049]" strokeweight="1pt"/>
+            <v:line w14:anchorId="206A8DDF" id="Přímá spojnice 11" o:spid="_x0000_s1026" style="position:absolute;z-index:251670016;visibility:visible;mso-wrap-style:square;mso-width-percent:0;mso-wrap-distance-left:9pt;mso-wrap-distance-top:0;mso-wrap-distance-right:9pt;mso-wrap-distance-bottom:0;mso-position-horizontal:absolute;mso-position-horizontal-relative:text;mso-position-vertical:absolute;mso-position-vertical-relative:text;mso-width-percent:0;mso-width-relative:margin" from="-.55pt,16.1pt" to="476.95pt,16.1pt" o:gfxdata="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" strokecolor="#f68c36 [3049]" strokeweight="1pt"/>
           </w:pict>
         </mc:Fallback>
       </mc:AlternateContent>

</xml_diff>